<commit_message>
Add GS-focused CV updates and Alter Landweg tracking.
Extend the school CV for primary-school relevance, document the supplement note, and record the Kaltenkirchen inquiry with interest draft in SH status.
</commit_message>
<xml_diff>
--- a/Bewerbungsmappe_Schule2026_Professionell/02_Lebenslauf/Lebenslauf_MASTER.docx
+++ b/Bewerbungsmappe_Schule2026_Professionell/02_Lebenslauf/Lebenslauf_MASTER.docx
@@ -82,6 +82,11 @@
           <w:szCs w:val="20"/>
         </w:rPr>
         <w:t xml:space="preserve">Promovierter Naturwissenschaftler (Dr. rer. nat.) mit über 8 Jahren Erfahrung in angewandter Forschung, numerischer Simulation und KI-basierter Datenanalyse. Ausgewiesene Expertise in elektromagnetischer Feldsimulation (FEM/FDTD), Optimierungsalgorithmen (Genetische Algorithmen, Evolutionäre Strategien) und maschinellem Lernen. Nachgewiesene Fähigkeit, komplexe wissenschaftliche Inhalte didaktisch klar und praxisnah an Studierende und Schüler zu vermitteln. Breite interdisziplinäre Kompetenz an der Schnittstelle von Physik, Elektrotechnik und Informatik.</w:t>
+      </w:r>
+    </w:p>
+    <w:p>
+      <w:r>
+        <w:t>Ergänzend zu meiner Hochschulerfahrung unterrichte ich seit etwa einem Jahr ehrenamtlich und regelmäßig online Schülerinnen und Schüler der Klassenstufen 6–8 in einem Verein. Mein naturwissenschaftlicher Hintergrund ermöglicht mir, Sachunterrichtsinhalte strukturiert und altersgerecht zu vermitteln. Schulerfahrung bringe ich durch Unterricht in Mathematik und Physik an der Gesamtschule Mümmelmannsberg sowie eine frühere Tätigkeit als Vertretungslehrkraft im öffentlichen Schuldienst (Hamburg) ein. An Grundschulen sehe ich mich insbesondere in der Rolle als fachliche Unterstützung und flexible Vertretung in Nebenfächern.</w:t>
       </w:r>
     </w:p>
     <w:p>
@@ -455,6 +460,21 @@
           <w:szCs w:val="22"/>
         </w:rPr>
         <w:t xml:space="preserve">BERUFLICHE LAUFBAHN</w:t>
+      </w:r>
+    </w:p>
+    <w:p>
+      <w:r>
+        <w:t>Ehrenamtlicher Online-Unterricht | Verein (ehrenamtlich) | Hamburg</w:t>
+      </w:r>
+    </w:p>
+    <w:p>
+      <w:r>
+        <w:t>2025 – heute</w:t>
+      </w:r>
+    </w:p>
+    <w:p>
+      <w:r>
+        <w:t>Regelmäßiger Online-Unterricht für Schülerinnen und Schüler der Klassenstufen 6–8; Nachhilfe und fachliche Vertiefung in Mathematik und Naturwissenschaften.</w:t>
       </w:r>
     </w:p>
     <w:p>

</xml_diff>